<commit_message>
Implement feature X to enhance user experience and fix bug Y in module Z
</commit_message>
<xml_diff>
--- a/reference-doc.docx
+++ b/reference-doc.docx
@@ -1261,6 +1261,7 @@
   <w:style w:type="table" w:default="1" w:styleId="a2">
     <w:name w:val="Normal Table"/>
     <w:uiPriority w:val="99"/>
+    <w:semiHidden/>
     <w:unhideWhenUsed/>
     <w:tblPr>
       <w:tblInd w:w="0" w:type="dxa"/>
@@ -1413,7 +1414,7 @@
     <w:qFormat/>
     <w:pPr>
       <w:keepNext/>
-      <w:spacing w:before="100" w:after="300"/>
+      <w:spacing w:before="100" w:after="120"/>
     </w:pPr>
     <w:rPr>
       <w:szCs w:val="20"/>
@@ -1576,6 +1577,7 @@
     <w:qFormat/>
     <w:rPr>
       <w:sz w:val="21"/>
+      <w:szCs w:val="20"/>
     </w:rPr>
     <w:tblPr>
       <w:jc w:val="center"/>

</xml_diff>

<commit_message>
Update reference-doc.docx to improve document structure and formatting
</commit_message>
<xml_diff>
--- a/reference-doc.docx
+++ b/reference-doc.docx
@@ -811,6 +811,7 @@
     </w:pPrDefault>
   </w:docDefaults>
   <w:latentStyles w:defLockedState="0" w:defUIPriority="0" w:defSemiHidden="0" w:defUnhideWhenUsed="0" w:defQFormat="0" w:count="376">
+    <w:lsdException w:name="caption" w:qFormat="1"/>
     <w:lsdException w:name="Normal Table" w:semiHidden="1" w:unhideWhenUsed="1"/>
     <w:lsdException w:name="Table Simple 1" w:semiHidden="1" w:unhideWhenUsed="1"/>
     <w:lsdException w:name="Table Simple 2" w:semiHidden="1" w:unhideWhenUsed="1"/>
@@ -1296,7 +1297,6 @@
   <w:style w:type="paragraph" w:customStyle="1" w:styleId="Compact">
     <w:name w:val="Compact"/>
     <w:basedOn w:val="a0"/>
-    <w:qFormat/>
     <w:pPr>
       <w:spacing w:before="36" w:after="36"/>
     </w:pPr>
@@ -1367,7 +1367,6 @@
     <w:name w:val="Author"/>
     <w:basedOn w:val="a4"/>
     <w:next w:val="a0"/>
-    <w:qFormat/>
     <w:pPr>
       <w:keepNext/>
       <w:keepLines/>
@@ -1381,7 +1380,6 @@
     <w:name w:val="Date"/>
     <w:basedOn w:val="a4"/>
     <w:next w:val="a0"/>
-    <w:qFormat/>
     <w:pPr>
       <w:keepNext/>
       <w:keepLines/>
@@ -1395,7 +1393,6 @@
     <w:name w:val="Abstract Title"/>
     <w:basedOn w:val="a"/>
     <w:next w:val="Abstract"/>
-    <w:qFormat/>
     <w:pPr>
       <w:keepNext/>
       <w:keepLines/>
@@ -1411,7 +1408,6 @@
     <w:name w:val="Abstract"/>
     <w:basedOn w:val="a"/>
     <w:next w:val="a0"/>
-    <w:qFormat/>
     <w:pPr>
       <w:keepNext/>
       <w:spacing w:before="100" w:after="120"/>
@@ -1542,7 +1538,6 @@
     <w:next w:val="a0"/>
     <w:uiPriority w:val="9"/>
     <w:unhideWhenUsed/>
-    <w:qFormat/>
     <w:pPr>
       <w:spacing w:before="100" w:after="100"/>
       <w:ind w:left="480" w:right="480"/>
@@ -1564,7 +1559,6 @@
     <w:next w:val="ab"/>
     <w:uiPriority w:val="9"/>
     <w:unhideWhenUsed/>
-    <w:qFormat/>
     <w:pPr>
       <w:spacing w:before="100" w:after="100"/>
       <w:ind w:left="480" w:right="480"/>
@@ -1630,6 +1624,7 @@
     <w:name w:val="caption"/>
     <w:basedOn w:val="a"/>
     <w:link w:val="ad"/>
+    <w:qFormat/>
     <w:pPr>
       <w:spacing w:after="120"/>
       <w:jc w:val="center"/>
@@ -1638,17 +1633,21 @@
   <w:style w:type="paragraph" w:customStyle="1" w:styleId="TableCaption">
     <w:name w:val="Table Caption"/>
     <w:basedOn w:val="ac"/>
+    <w:qFormat/>
     <w:pPr>
       <w:keepNext/>
+      <w:spacing w:after="0"/>
     </w:pPr>
   </w:style>
   <w:style w:type="paragraph" w:customStyle="1" w:styleId="ImageCaption">
     <w:name w:val="Image Caption"/>
     <w:basedOn w:val="ac"/>
+    <w:qFormat/>
   </w:style>
   <w:style w:type="paragraph" w:customStyle="1" w:styleId="Figure">
     <w:name w:val="Figure"/>
     <w:basedOn w:val="a"/>
+    <w:qFormat/>
     <w:pPr>
       <w:jc w:val="center"/>
     </w:pPr>
@@ -1656,6 +1655,7 @@
   <w:style w:type="paragraph" w:customStyle="1" w:styleId="CaptionedFigure">
     <w:name w:val="Captioned Figure"/>
     <w:basedOn w:val="Figure"/>
+    <w:qFormat/>
     <w:pPr>
       <w:keepNext/>
       <w:spacing w:after="0"/>

</xml_diff>

<commit_message>
Update reference-doc.docx to enhance document structure and formatting
</commit_message>
<xml_diff>
--- a/reference-doc.docx
+++ b/reference-doc.docx
@@ -1769,6 +1769,15 @@
   <w:style w:type="character" w:styleId="af4">
     <w:name w:val="line number"/>
     <w:basedOn w:val="a1"/>
+  </w:style>
+  <w:style w:type="character" w:customStyle="1" w:styleId="Emphasis">
+    <w:name w:val="Emphasis"/>
+    <w:basedOn w:val="a1"/>
+    <w:uiPriority w:val="1"/>
+    <w:qFormat/>
+    <w:rPr>
+      <w:color w:val="EE0000"/>
+    </w:rPr>
   </w:style>
 </w:styles>
 </file>

</xml_diff>

<commit_message>
style(reference-doc): add custom "Reply to Reviewers" paragraph style with blue color
</commit_message>
<xml_diff>
--- a/reference-doc.docx
+++ b/reference-doc.docx
@@ -1775,10 +1775,18 @@
     <w:basedOn w:val="a1"/>
     <w:uiPriority w:val="1"/>
     <w:qFormat/>
-    <w:rsid w:val="00467D81"/>
     <w:rPr>
       <w:i/>
       <w:color w:val="auto"/>
+    </w:rPr>
+  </w:style>
+  <w:style w:type="paragraph" w:customStyle="1" w:styleId="ReplytoReviewers">
+    <w:name w:val="Reply to Reviewers"/>
+    <w:basedOn w:val="a0"/>
+    <w:qFormat/>
+    <w:rsid w:val="00036427"/>
+    <w:rPr>
+      <w:color w:val="0000FF"/>
     </w:rPr>
   </w:style>
 </w:styles>

</xml_diff>

<commit_message>
add "Reply Char" character style with blue color
</commit_message>
<xml_diff>
--- a/reference-doc.docx
+++ b/reference-doc.docx
@@ -1300,6 +1300,7 @@
     <w:basedOn w:val="a0"/>
     <w:pPr>
       <w:spacing w:before="36" w:after="36"/>
+      <w:ind w:firstLineChars="0" w:firstLine="0"/>
     </w:pPr>
   </w:style>
   <w:style w:type="paragraph" w:styleId="a4">
@@ -1771,8 +1772,8 @@
     <w:name w:val="line number"/>
     <w:basedOn w:val="a1"/>
   </w:style>
-  <w:style w:type="character" w:customStyle="1" w:styleId="11">
-    <w:name w:val="强调1"/>
+  <w:style w:type="character" w:customStyle="1" w:styleId="Emphasis">
+    <w:name w:val="Emphasis"/>
     <w:basedOn w:val="a1"/>
     <w:uiPriority w:val="1"/>
     <w:qFormat/>
@@ -1793,10 +1794,17 @@
     <w:name w:val="Reply Header"/>
     <w:basedOn w:val="a0"/>
     <w:qFormat/>
-    <w:rsid w:val="002923EC"/>
     <w:pPr>
       <w:spacing w:before="0" w:after="0"/>
     </w:pPr>
+    <w:rPr>
+      <w:color w:val="0000FF"/>
+    </w:rPr>
+  </w:style>
+  <w:style w:type="character" w:customStyle="1" w:styleId="ReplyChar">
+    <w:name w:val="Reply Char"/>
+    <w:uiPriority w:val="1"/>
+    <w:qFormat/>
     <w:rPr>
       <w:color w:val="0000FF"/>
     </w:rPr>

</xml_diff>

<commit_message>
style(reference-doc): add custom "Revision Char" and "Revision Para" styles with red color
</commit_message>
<xml_diff>
--- a/reference-doc.docx
+++ b/reference-doc.docx
@@ -1807,6 +1807,24 @@
     <w:qFormat/>
     <w:rPr>
       <w:color w:val="0000FF"/>
+    </w:rPr>
+  </w:style>
+  <w:style w:type="character" w:customStyle="1" w:styleId="RevisionChar">
+    <w:name w:val="Revision Char"/>
+    <w:basedOn w:val="a1"/>
+    <w:uiPriority w:val="1"/>
+    <w:qFormat/>
+    <w:rPr>
+      <w:color w:val="EE0000"/>
+    </w:rPr>
+  </w:style>
+  <w:style w:type="paragraph" w:customStyle="1" w:styleId="RevisionPara">
+    <w:name w:val="Revision Para"/>
+    <w:basedOn w:val="a0"/>
+    <w:next w:val="a0"/>
+    <w:qFormat/>
+    <w:rPr>
+      <w:color w:val="EE0000"/>
     </w:rPr>
   </w:style>
 </w:styles>

</xml_diff>

<commit_message>
style(reference-doc): remove qFormat from Reply to Reviewers, Reply Header, and Revision Para styles
</commit_message>
<xml_diff>
--- a/reference-doc.docx
+++ b/reference-doc.docx
@@ -1300,7 +1300,6 @@
     <w:basedOn w:val="a0"/>
     <w:pPr>
       <w:spacing w:before="36" w:after="36"/>
-      <w:ind w:firstLineChars="0" w:firstLine="0"/>
     </w:pPr>
   </w:style>
   <w:style w:type="paragraph" w:styleId="a4">
@@ -1772,8 +1771,8 @@
     <w:name w:val="line number"/>
     <w:basedOn w:val="a1"/>
   </w:style>
-  <w:style w:type="character" w:customStyle="1" w:styleId="Emphasis">
-    <w:name w:val="Emphasis"/>
+  <w:style w:type="character" w:customStyle="1" w:styleId="11">
+    <w:name w:val="强调1"/>
     <w:basedOn w:val="a1"/>
     <w:uiPriority w:val="1"/>
     <w:qFormat/>
@@ -1785,7 +1784,6 @@
   <w:style w:type="paragraph" w:customStyle="1" w:styleId="ReplytoReviewers">
     <w:name w:val="Reply to Reviewers"/>
     <w:basedOn w:val="a0"/>
-    <w:qFormat/>
     <w:rPr>
       <w:color w:val="0000FF"/>
     </w:rPr>
@@ -1793,7 +1791,6 @@
   <w:style w:type="paragraph" w:customStyle="1" w:styleId="ReplyHeader">
     <w:name w:val="Reply Header"/>
     <w:basedOn w:val="a0"/>
-    <w:qFormat/>
     <w:pPr>
       <w:spacing w:before="0" w:after="0"/>
     </w:pPr>
@@ -1822,7 +1819,6 @@
     <w:name w:val="Revision Para"/>
     <w:basedOn w:val="a0"/>
     <w:next w:val="a0"/>
-    <w:qFormat/>
     <w:rPr>
       <w:color w:val="EE0000"/>
     </w:rPr>

</xml_diff>

<commit_message>
style(reference-doc): rename Emphasis style to Emphasis Char
</commit_message>
<xml_diff>
--- a/reference-doc.docx
+++ b/reference-doc.docx
@@ -1771,8 +1771,8 @@
     <w:name w:val="line number"/>
     <w:basedOn w:val="a1"/>
   </w:style>
-  <w:style w:type="character" w:customStyle="1" w:styleId="11">
-    <w:name w:val="强调1"/>
+  <w:style w:type="character" w:customStyle="1" w:styleId="EmphasisChar">
+    <w:name w:val="Emphasis Char"/>
     <w:basedOn w:val="a1"/>
     <w:uiPriority w:val="1"/>
     <w:qFormat/>

</xml_diff>

<commit_message>
style(reference-doc): update Emphasis Char style with font and size adjustments
</commit_message>
<xml_diff>
--- a/reference-doc.docx
+++ b/reference-doc.docx
@@ -1771,6 +1771,10 @@
   <w:style w:type="character" w:styleId="af4">
     <w:name w:val="line number"/>
     <w:basedOn w:val="a1"/>
+    <w:rPr>
+      <w:rFonts w:ascii="Times New Roman" w:eastAsia="Times New Roman" w:hAnsi="Times New Roman"/>
+      <w:sz w:val="24"/>
+    </w:rPr>
   </w:style>
   <w:style w:type="character" w:customStyle="1" w:styleId="EmphasisChar">
     <w:name w:val="Emphasis Char"/>

</xml_diff>

<commit_message>
style(reference-doc): add new Quote style and update document structure with lock quote
</commit_message>
<xml_diff>
--- a/reference-doc.docx
+++ b/reference-doc.docx
@@ -481,6 +481,23 @@
         <w:t>Definition</w:t>
       </w:r>
     </w:p>
+    <w:p>
+      <w:pPr>
+        <w:pStyle w:val="af5"/>
+        <w:rPr>
+          <w:rFonts w:hint="eastAsia"/>
+        </w:rPr>
+      </w:pPr>
+      <w:r>
+        <w:rPr>
+          <w:rFonts w:hint="eastAsia"/>
+        </w:rPr>
+        <w:t>B</w:t>
+      </w:r>
+      <w:r>
+        <w:t>lock quote</w:t>
+      </w:r>
+    </w:p>
     <w:sectPr>
       <w:footnotePr>
         <w:numRestart w:val="eachSect"/>
@@ -877,6 +894,7 @@
     <w:lsdException w:name="Medium Shading 1 Accent 1"/>
     <w:lsdException w:name="Medium Shading 2 Accent 1"/>
     <w:lsdException w:name="Medium List 1 Accent 1"/>
+    <w:lsdException w:name="Quote" w:qFormat="1"/>
     <w:lsdException w:name="Medium List 2 Accent 1"/>
     <w:lsdException w:name="Medium Grid 1 Accent 1"/>
     <w:lsdException w:name="Medium Grid 2 Accent 1"/>
@@ -1826,6 +1844,17 @@
     <w:next w:val="a0"/>
     <w:rPr>
       <w:color w:val="EE0000"/>
+    </w:rPr>
+  </w:style>
+  <w:style w:type="paragraph" w:styleId="af5">
+    <w:name w:val="Quote"/>
+    <w:basedOn w:val="a"/>
+    <w:next w:val="a"/>
+    <w:link w:val="af6"/>
+    <w:qFormat/>
+    <w:rPr>
+      <w:i/>
+      <w:iCs/>
     </w:rPr>
   </w:style>
 </w:styles>

</xml_diff>